<commit_message>
Fix 5 reviewer inconsistencies and add 19 missing references
1. Creator-type: Methods now includes organisations in non-professional
   definition, matching Results (n=152 = influencers + general users + orgs)
2. JAMA table: Text reference corrected from Table 5 to Table 4
3. Content format: Section 3.8 and Appendix C9 counts now match Table 2
   (Short Video n=47, Image+Caption n=21, Carousel n=37)
4. Post-hoc stats: Appendix C3 renamed to Mann-Whitney U; Appendix D
   eta-squared formula corrected to (H-k+1)/(N-k) matching Methods
5. References: Added 19 missing cited entries (Ayyash, Cohen, de Moel-Mandel,
   Delli, Drozd, Feinstein, Fritz, Leong, Madathil, McKinney, Naaman, Osman,
   Schober, Sullivan, Terpilowski, Tomczak, Vallat, Virtanen); total now 61

Co-Authored-By: Claude Opus 4.6 <noreply@anthropic.com>
</commit_message>
<xml_diff>
--- a/chapters/chapter3_findings.docx
+++ b/chapters/chapter3_findings.docx
@@ -3297,7 +3297,7 @@
           <w:color w:val="000000"/>
           <w:sz w:val="24"/>
         </w:rPr>
-        <w:t>JAMA benchmark compliance varied by criterion and platform (Table 5). A Kruskal-Wallis test on JAMA total scores (range 0–4) revealed no statistically significant difference across platforms, H(3) = 5.43, p = .143. However, this aggregate result is partly an artefact of the Currency criterion, which gives social media platforms an automatic advantage: posting dates are inherently visible (100% compliance) on social media but must be explicitly stated on websites (68% compliance). Criterion-level comparisons are therefore more informative than total JAMA scores in this study.</w:t>
+        <w:t>JAMA benchmark compliance varied by criterion and platform (Table 4). A Kruskal-Wallis test on JAMA total scores (range 0–4) revealed no statistically significant difference across platforms, H(3) = 5.43, p = .143. However, this aggregate result is partly an artefact of the Currency criterion, which gives social media platforms an automatic advantage: posting dates are inherently visible (100% compliance) on social media but must be explicitly stated on websites (68% compliance). Criterion-level comparisons are therefore more informative than total JAMA scores in this study.</w:t>
       </w:r>
     </w:p>
     <w:p>
@@ -4423,7 +4423,7 @@
           <w:color w:val="000000"/>
           <w:sz w:val="24"/>
         </w:rPr>
-        <w:t>Exploratory analysis of content format revealed notable differences in DISCERN scores. Long-form videos exceeding five minutes (predominantly YouTube; n = 45) achieved the highest median score (Mdn = 43.0, M = 43.1), followed by text articles (n = 50, Mdn = 48.5, M = 47.0, which were exclusive to websites). Short videos under 60 seconds (n = 18, Mdn = 31.5, M = 32.8) and carousel posts (n = 50, Mdn = 27.5, M = 29.0) scored substantially lower. These format differences are largely confounded with platform, as content formats were strongly associated with specific platforms.</w:t>
+        <w:t>Exploratory analysis of content format revealed notable differences in DISCERN scores. Text articles (n = 50, exclusive to websites) achieved the highest median score (Mdn = 48.5, M = 47.0), followed by long-form videos exceeding five minutes (predominantly YouTube; n = 45, Mdn = 43.0, M = 43.1). Short videos under 60 seconds (n = 47, comprising 5 from YouTube and 42 from TikTok; Mdn = 34.0, M = 33.8) scored lower. Image-with-caption posts (n = 21, from TikTok and Instagram; Mdn = 30.0, M = 30.5) and carousel posts (n = 37, exclusive to Instagram; Mdn = 27.5, M = 28.4) scored lowest. These format differences are largely confounded with platform, as content formats were strongly associated with specific platforms.</w:t>
       </w:r>
     </w:p>
     <w:p>

</xml_diff>